<commit_message>
Phase- 6 changes are commited
</commit_message>
<xml_diff>
--- a/docs/Phase 5 - Documentation.docx
+++ b/docs/Phase 5 - Documentation.docx
@@ -13,21 +13,43 @@
         <w:rPr>
           <w:lang w:val="en-US"/>
         </w:rPr>
-        <w:t xml:space="preserve">Phase 5  - Tools </w:t>
-      </w:r>
-    </w:p>
-    <w:p>
-      <w:pPr>
-        <w:rPr>
-          <w:lang w:val="en-US"/>
-        </w:rPr>
-      </w:pPr>
-      <w:r>
-        <w:rPr>
-          <w:lang w:val="en-US"/>
-        </w:rPr>
-        <w:t>I’ve Create 4 Tools for the Banking Agent :</w:t>
-      </w:r>
+        <w:t xml:space="preserve">Phase </w:t>
+      </w:r>
+      <w:proofErr w:type="gramStart"/>
+      <w:r>
+        <w:rPr>
+          <w:lang w:val="en-US"/>
+        </w:rPr>
+        <w:t>5  -</w:t>
+      </w:r>
+      <w:proofErr w:type="gramEnd"/>
+      <w:r>
+        <w:rPr>
+          <w:lang w:val="en-US"/>
+        </w:rPr>
+        <w:t xml:space="preserve"> Tools </w:t>
+      </w:r>
+    </w:p>
+    <w:p>
+      <w:pPr>
+        <w:rPr>
+          <w:lang w:val="en-US"/>
+        </w:rPr>
+      </w:pPr>
+      <w:r>
+        <w:rPr>
+          <w:lang w:val="en-US"/>
+        </w:rPr>
+        <w:t xml:space="preserve">I’ve Create 4 Tools for the Banking </w:t>
+      </w:r>
+      <w:proofErr w:type="gramStart"/>
+      <w:r>
+        <w:rPr>
+          <w:lang w:val="en-US"/>
+        </w:rPr>
+        <w:t>Agent :</w:t>
+      </w:r>
+      <w:proofErr w:type="gramEnd"/>
     </w:p>
     <w:p>
       <w:pPr>
@@ -69,7 +91,21 @@
         <w:rPr>
           <w:lang w:val="en-US"/>
         </w:rPr>
-        <w:t>Calculator – For  all calculations</w:t>
+        <w:t xml:space="preserve">Calculator – </w:t>
+      </w:r>
+      <w:proofErr w:type="gramStart"/>
+      <w:r>
+        <w:rPr>
+          <w:lang w:val="en-US"/>
+        </w:rPr>
+        <w:t>For  all</w:t>
+      </w:r>
+      <w:proofErr w:type="gramEnd"/>
+      <w:r>
+        <w:rPr>
+          <w:lang w:val="en-US"/>
+        </w:rPr>
+        <w:t xml:space="preserve"> calculations</w:t>
       </w:r>
     </w:p>
     <w:p>
@@ -101,11 +137,19 @@
           <w:lang w:val="en-US"/>
         </w:rPr>
       </w:pPr>
-      <w:r>
-        <w:rPr>
-          <w:lang w:val="en-US"/>
-        </w:rPr>
-        <w:t>Supabase Db for Transactional Data.</w:t>
+      <w:proofErr w:type="spellStart"/>
+      <w:r>
+        <w:rPr>
+          <w:lang w:val="en-US"/>
+        </w:rPr>
+        <w:t>Supabase</w:t>
+      </w:r>
+      <w:proofErr w:type="spellEnd"/>
+      <w:r>
+        <w:rPr>
+          <w:lang w:val="en-US"/>
+        </w:rPr>
+        <w:t xml:space="preserve"> Db for Transactional Data.</w:t>
       </w:r>
     </w:p>
     <w:p>
@@ -149,18 +193,7 @@
           <w:iCs/>
           <w:lang w:val="en-US"/>
         </w:rPr>
-        <w:t xml:space="preserve">“”” </w:t>
-      </w:r>
-      <w:r>
-        <w:rPr>
-          <w:rFonts w:ascii="Candara Light" w:hAnsi="Candara Light"/>
-          <w:b/>
-          <w:bCs/>
-          <w:i/>
-          <w:iCs/>
-          <w:lang w:val="en-US"/>
-        </w:rPr>
-        <w:t>Choose tools automatically when needed.</w:t>
+        <w:t>“”” Choose tools automatically when needed.</w:t>
       </w:r>
     </w:p>
     <w:p>
@@ -206,86 +239,138 @@
           <w:iCs/>
           <w:lang w:val="en-US"/>
         </w:rPr>
-        <w:t>Use Supabase tools for customer, loan, branch, and transaction data.</w:t>
-      </w:r>
-    </w:p>
-    <w:p>
-      <w:pPr>
-        <w:rPr>
-          <w:rFonts w:ascii="Candara Light" w:hAnsi="Candara Light"/>
-          <w:b/>
-          <w:bCs/>
-          <w:i/>
-          <w:iCs/>
-          <w:lang w:val="en-US"/>
-        </w:rPr>
-      </w:pPr>
-      <w:r>
-        <w:rPr>
-          <w:rFonts w:ascii="Candara Light" w:hAnsi="Candara Light"/>
-          <w:b/>
-          <w:bCs/>
-          <w:i/>
-          <w:iCs/>
-          <w:lang w:val="en-US"/>
-        </w:rPr>
-        <w:t xml:space="preserve">Use search_api </w:t>
-      </w:r>
-      <w:r>
-        <w:rPr>
-          <w:rFonts w:ascii="Candara Light" w:hAnsi="Candara Light"/>
-          <w:b/>
-          <w:bCs/>
-          <w:i/>
-          <w:iCs/>
-          <w:lang w:val="en-US"/>
-        </w:rPr>
-        <w:t>to</w:t>
-      </w:r>
-      <w:r>
-        <w:rPr>
-          <w:rFonts w:ascii="Candara Light" w:hAnsi="Candara Light"/>
-          <w:b/>
-          <w:bCs/>
-          <w:i/>
-          <w:iCs/>
-          <w:lang w:val="en-US"/>
-        </w:rPr>
-        <w:t xml:space="preserve"> search internet and get response for User Query..</w:t>
-      </w:r>
-    </w:p>
-    <w:p>
-      <w:pPr>
-        <w:rPr>
-          <w:rFonts w:ascii="Candara Light" w:hAnsi="Candara Light"/>
-          <w:b/>
-          <w:bCs/>
-          <w:i/>
-          <w:iCs/>
-          <w:lang w:val="en-US"/>
-        </w:rPr>
-      </w:pPr>
-      <w:r>
-        <w:rPr>
-          <w:rFonts w:ascii="Candara Light" w:hAnsi="Candara Light"/>
-          <w:b/>
-          <w:bCs/>
-          <w:i/>
-          <w:iCs/>
-          <w:lang w:val="en-US"/>
-        </w:rPr>
-        <w:t>Use rag_retrieval for internal banking document context first.</w:t>
-      </w:r>
-      <w:r>
-        <w:rPr>
-          <w:rFonts w:ascii="Candara Light" w:hAnsi="Candara Light"/>
-          <w:b/>
-          <w:bCs/>
-          <w:i/>
-          <w:iCs/>
-          <w:lang w:val="en-US"/>
-        </w:rPr>
-        <w:t>”””</w:t>
+        <w:t xml:space="preserve">Use </w:t>
+      </w:r>
+      <w:proofErr w:type="spellStart"/>
+      <w:r>
+        <w:rPr>
+          <w:rFonts w:ascii="Candara Light" w:hAnsi="Candara Light"/>
+          <w:b/>
+          <w:bCs/>
+          <w:i/>
+          <w:iCs/>
+          <w:lang w:val="en-US"/>
+        </w:rPr>
+        <w:t>Supabase</w:t>
+      </w:r>
+      <w:proofErr w:type="spellEnd"/>
+      <w:r>
+        <w:rPr>
+          <w:rFonts w:ascii="Candara Light" w:hAnsi="Candara Light"/>
+          <w:b/>
+          <w:bCs/>
+          <w:i/>
+          <w:iCs/>
+          <w:lang w:val="en-US"/>
+        </w:rPr>
+        <w:t xml:space="preserve"> tools for customer, loan, branch, and transaction data.</w:t>
+      </w:r>
+    </w:p>
+    <w:p>
+      <w:pPr>
+        <w:rPr>
+          <w:rFonts w:ascii="Candara Light" w:hAnsi="Candara Light"/>
+          <w:b/>
+          <w:bCs/>
+          <w:i/>
+          <w:iCs/>
+          <w:lang w:val="en-US"/>
+        </w:rPr>
+      </w:pPr>
+      <w:r>
+        <w:rPr>
+          <w:rFonts w:ascii="Candara Light" w:hAnsi="Candara Light"/>
+          <w:b/>
+          <w:bCs/>
+          <w:i/>
+          <w:iCs/>
+          <w:lang w:val="en-US"/>
+        </w:rPr>
+        <w:t xml:space="preserve">Use </w:t>
+      </w:r>
+      <w:proofErr w:type="spellStart"/>
+      <w:r>
+        <w:rPr>
+          <w:rFonts w:ascii="Candara Light" w:hAnsi="Candara Light"/>
+          <w:b/>
+          <w:bCs/>
+          <w:i/>
+          <w:iCs/>
+          <w:lang w:val="en-US"/>
+        </w:rPr>
+        <w:t>search_api</w:t>
+      </w:r>
+      <w:proofErr w:type="spellEnd"/>
+      <w:r>
+        <w:rPr>
+          <w:rFonts w:ascii="Candara Light" w:hAnsi="Candara Light"/>
+          <w:b/>
+          <w:bCs/>
+          <w:i/>
+          <w:iCs/>
+          <w:lang w:val="en-US"/>
+        </w:rPr>
+        <w:t xml:space="preserve"> to search internet and get response for User </w:t>
+      </w:r>
+      <w:proofErr w:type="gramStart"/>
+      <w:r>
+        <w:rPr>
+          <w:rFonts w:ascii="Candara Light" w:hAnsi="Candara Light"/>
+          <w:b/>
+          <w:bCs/>
+          <w:i/>
+          <w:iCs/>
+          <w:lang w:val="en-US"/>
+        </w:rPr>
+        <w:t>Query..</w:t>
+      </w:r>
+      <w:proofErr w:type="gramEnd"/>
+    </w:p>
+    <w:p>
+      <w:pPr>
+        <w:rPr>
+          <w:rFonts w:ascii="Candara Light" w:hAnsi="Candara Light"/>
+          <w:b/>
+          <w:bCs/>
+          <w:i/>
+          <w:iCs/>
+          <w:lang w:val="en-US"/>
+        </w:rPr>
+      </w:pPr>
+      <w:r>
+        <w:rPr>
+          <w:rFonts w:ascii="Candara Light" w:hAnsi="Candara Light"/>
+          <w:b/>
+          <w:bCs/>
+          <w:i/>
+          <w:iCs/>
+          <w:lang w:val="en-US"/>
+        </w:rPr>
+        <w:t xml:space="preserve">Use </w:t>
+      </w:r>
+      <w:proofErr w:type="spellStart"/>
+      <w:r>
+        <w:rPr>
+          <w:rFonts w:ascii="Candara Light" w:hAnsi="Candara Light"/>
+          <w:b/>
+          <w:bCs/>
+          <w:i/>
+          <w:iCs/>
+          <w:lang w:val="en-US"/>
+        </w:rPr>
+        <w:t>rag_retrieval</w:t>
+      </w:r>
+      <w:proofErr w:type="spellEnd"/>
+      <w:r>
+        <w:rPr>
+          <w:rFonts w:ascii="Candara Light" w:hAnsi="Candara Light"/>
+          <w:b/>
+          <w:bCs/>
+          <w:i/>
+          <w:iCs/>
+          <w:lang w:val="en-US"/>
+        </w:rPr>
+        <w:t xml:space="preserve"> for internal banking document context first.”””</w:t>
       </w:r>
     </w:p>
     <w:p>
@@ -345,7 +430,35 @@
         <w:rPr>
           <w:lang w:val="en-US"/>
         </w:rPr>
-        <w:t>The Supabase DB didn’t return any values. Because the Roles are not sent to Supabase correctly</w:t>
+        <w:t xml:space="preserve">The </w:t>
+      </w:r>
+      <w:proofErr w:type="spellStart"/>
+      <w:r>
+        <w:rPr>
+          <w:lang w:val="en-US"/>
+        </w:rPr>
+        <w:t>Supabase</w:t>
+      </w:r>
+      <w:proofErr w:type="spellEnd"/>
+      <w:r>
+        <w:rPr>
+          <w:lang w:val="en-US"/>
+        </w:rPr>
+        <w:t xml:space="preserve"> DB didn’t return any values. Because the Roles are not sent to </w:t>
+      </w:r>
+      <w:proofErr w:type="spellStart"/>
+      <w:r>
+        <w:rPr>
+          <w:lang w:val="en-US"/>
+        </w:rPr>
+        <w:t>Supabase</w:t>
+      </w:r>
+      <w:proofErr w:type="spellEnd"/>
+      <w:r>
+        <w:rPr>
+          <w:lang w:val="en-US"/>
+        </w:rPr>
+        <w:t xml:space="preserve"> correctly</w:t>
       </w:r>
     </w:p>
     <w:p>
@@ -436,6 +549,7 @@
       </w:pPr>
       <w:r>
         <w:rPr>
+          <w:noProof/>
           <w:lang w:val="en-US"/>
         </w:rPr>
         <w:lastRenderedPageBreak/>
@@ -491,6 +605,7 @@
       </w:pPr>
       <w:r>
         <w:rPr>
+          <w:noProof/>
           <w:lang w:val="en-US"/>
         </w:rPr>
         <w:drawing>
@@ -622,8 +737,16 @@
         <w:rPr>
           <w:lang w:val="en-US"/>
         </w:rPr>
-        <w:t>Set up RLS for Supabase</w:t>
-      </w:r>
+        <w:t xml:space="preserve">Set up RLS for </w:t>
+      </w:r>
+      <w:proofErr w:type="spellStart"/>
+      <w:r>
+        <w:rPr>
+          <w:lang w:val="en-US"/>
+        </w:rPr>
+        <w:t>Supabase</w:t>
+      </w:r>
+      <w:proofErr w:type="spellEnd"/>
     </w:p>
     <w:p>
       <w:pPr>
@@ -713,6 +836,7 @@
       </w:pPr>
       <w:r>
         <w:rPr>
+          <w:noProof/>
           <w:lang w:val="en-US"/>
         </w:rPr>
         <w:drawing>
@@ -834,6 +958,7 @@
       </w:pPr>
       <w:r>
         <w:rPr>
+          <w:noProof/>
           <w:lang w:val="en-US"/>
         </w:rPr>
         <w:drawing>
@@ -888,6 +1013,7 @@
       </w:pPr>
       <w:r>
         <w:rPr>
+          <w:noProof/>
           <w:lang w:val="en-US"/>
         </w:rPr>
         <w:drawing>
@@ -935,6 +1061,7 @@
       </w:pPr>
       <w:r>
         <w:rPr>
+          <w:noProof/>
           <w:lang w:val="en-US"/>
         </w:rPr>
         <w:drawing>
@@ -1036,7 +1163,15 @@
         </w:numPr>
       </w:pPr>
       <w:r>
-        <w:t>or confidence_score &lt; 0.6</w:t>
+        <w:t>or </w:t>
+      </w:r>
+      <w:proofErr w:type="spellStart"/>
+      <w:r>
+        <w:t>confidence_score</w:t>
+      </w:r>
+      <w:proofErr w:type="spellEnd"/>
+      <w:r>
+        <w:t xml:space="preserve"> &lt; 0.6</w:t>
       </w:r>
     </w:p>
     <w:p>
@@ -1057,13 +1192,19 @@
     </w:p>
     <w:p/>
     <w:p>
-      <w:r>
-        <w:t>Similarly the Calculator tool, when pass 10% the calculation fails. Since it not eliminating % during calculation.</w:t>
-      </w:r>
-    </w:p>
-    <w:p>
-      <w:r>
-        <w:rPr>
+      <w:proofErr w:type="gramStart"/>
+      <w:r>
+        <w:t>Similarly</w:t>
+      </w:r>
+      <w:proofErr w:type="gramEnd"/>
+      <w:r>
+        <w:t xml:space="preserve"> the Calculator tool, when pass 10% the calculation fails. Since it not eliminating % during calculation.</w:t>
+      </w:r>
+    </w:p>
+    <w:p>
+      <w:r>
+        <w:rPr>
+          <w:noProof/>
           <w:lang w:val="en-US"/>
         </w:rPr>
         <w:drawing>
@@ -1105,6 +1246,9 @@
     </w:p>
     <w:p>
       <w:r>
+        <w:rPr>
+          <w:noProof/>
+        </w:rPr>
         <w:drawing>
           <wp:inline distT="0" distB="0" distL="0" distR="0" wp14:anchorId="0FC8CBE8" wp14:editId="72C996F1">
             <wp:extent cx="5731510" cy="1436370"/>
@@ -1188,18 +1332,31 @@
           <w:iCs/>
           <w:lang w:val="en-US"/>
         </w:rPr>
-        <w:t>“””</w:t>
-      </w:r>
-      <w:r>
-        <w:rPr>
-          <w:rFonts w:ascii="Candara Light" w:hAnsi="Candara Light"/>
-          <w:b/>
-          <w:bCs/>
-          <w:i/>
-          <w:iCs/>
-          <w:lang w:val="en-US"/>
-        </w:rPr>
-        <w:t>Choose tools automatically when needed.</w:t>
+        <w:t>“</w:t>
+      </w:r>
+      <w:proofErr w:type="gramStart"/>
+      <w:r>
+        <w:rPr>
+          <w:rFonts w:ascii="Candara Light" w:hAnsi="Candara Light"/>
+          <w:b/>
+          <w:bCs/>
+          <w:i/>
+          <w:iCs/>
+          <w:lang w:val="en-US"/>
+        </w:rPr>
+        <w:t>””Choose</w:t>
+      </w:r>
+      <w:proofErr w:type="gramEnd"/>
+      <w:r>
+        <w:rPr>
+          <w:rFonts w:ascii="Candara Light" w:hAnsi="Candara Light"/>
+          <w:b/>
+          <w:bCs/>
+          <w:i/>
+          <w:iCs/>
+          <w:lang w:val="en-US"/>
+        </w:rPr>
+        <w:t xml:space="preserve"> tools automatically when needed.</w:t>
       </w:r>
     </w:p>
     <w:p>
@@ -1245,76 +1402,172 @@
           <w:iCs/>
           <w:lang w:val="en-US"/>
         </w:rPr>
-        <w:t>When a formula or rate is learned from search_api or internal context, use calculator for the actual numeric computation.</w:t>
-      </w:r>
-    </w:p>
-    <w:p>
-      <w:pPr>
-        <w:rPr>
-          <w:rFonts w:ascii="Candara Light" w:hAnsi="Candara Light"/>
-          <w:b/>
-          <w:bCs/>
-          <w:i/>
-          <w:iCs/>
-          <w:lang w:val="en-US"/>
-        </w:rPr>
-      </w:pPr>
-      <w:r>
-        <w:rPr>
-          <w:rFonts w:ascii="Candara Light" w:hAnsi="Candara Light"/>
-          <w:b/>
-          <w:bCs/>
-          <w:i/>
-          <w:iCs/>
-          <w:lang w:val="en-US"/>
-        </w:rPr>
-        <w:t>Use Supabase tools for customer, loan, branch, and transaction data.</w:t>
-      </w:r>
-    </w:p>
-    <w:p>
-      <w:pPr>
-        <w:rPr>
-          <w:rFonts w:ascii="Candara Light" w:hAnsi="Candara Light"/>
-          <w:b/>
-          <w:bCs/>
-          <w:i/>
-          <w:iCs/>
-          <w:lang w:val="en-US"/>
-        </w:rPr>
-      </w:pPr>
-      <w:r>
-        <w:rPr>
-          <w:rFonts w:ascii="Candara Light" w:hAnsi="Candara Light"/>
-          <w:b/>
-          <w:bCs/>
-          <w:i/>
-          <w:iCs/>
-          <w:lang w:val="en-US"/>
-        </w:rPr>
-        <w:t>Use search_api for external rate lookup when internal context is weak or unavailable.</w:t>
-      </w:r>
-    </w:p>
-    <w:p>
-      <w:pPr>
-        <w:rPr>
-          <w:rFonts w:ascii="Candara Light" w:hAnsi="Candara Light"/>
-          <w:b/>
-          <w:bCs/>
-          <w:i/>
-          <w:iCs/>
-          <w:lang w:val="en-US"/>
-        </w:rPr>
-      </w:pPr>
-      <w:r>
-        <w:rPr>
-          <w:rFonts w:ascii="Candara Light" w:hAnsi="Candara Light"/>
-          <w:b/>
-          <w:bCs/>
-          <w:i/>
-          <w:iCs/>
-          <w:lang w:val="en-US"/>
-        </w:rPr>
-        <w:t>Use rag_retrieval for internal banking document context first.</w:t>
+        <w:t xml:space="preserve">When a formula or rate is learned from </w:t>
+      </w:r>
+      <w:proofErr w:type="spellStart"/>
+      <w:r>
+        <w:rPr>
+          <w:rFonts w:ascii="Candara Light" w:hAnsi="Candara Light"/>
+          <w:b/>
+          <w:bCs/>
+          <w:i/>
+          <w:iCs/>
+          <w:lang w:val="en-US"/>
+        </w:rPr>
+        <w:t>search_api</w:t>
+      </w:r>
+      <w:proofErr w:type="spellEnd"/>
+      <w:r>
+        <w:rPr>
+          <w:rFonts w:ascii="Candara Light" w:hAnsi="Candara Light"/>
+          <w:b/>
+          <w:bCs/>
+          <w:i/>
+          <w:iCs/>
+          <w:lang w:val="en-US"/>
+        </w:rPr>
+        <w:t xml:space="preserve"> or internal context, use calculator for the actual numeric computation.</w:t>
+      </w:r>
+    </w:p>
+    <w:p>
+      <w:pPr>
+        <w:rPr>
+          <w:rFonts w:ascii="Candara Light" w:hAnsi="Candara Light"/>
+          <w:b/>
+          <w:bCs/>
+          <w:i/>
+          <w:iCs/>
+          <w:lang w:val="en-US"/>
+        </w:rPr>
+      </w:pPr>
+      <w:r>
+        <w:rPr>
+          <w:rFonts w:ascii="Candara Light" w:hAnsi="Candara Light"/>
+          <w:b/>
+          <w:bCs/>
+          <w:i/>
+          <w:iCs/>
+          <w:lang w:val="en-US"/>
+        </w:rPr>
+        <w:t xml:space="preserve">Use </w:t>
+      </w:r>
+      <w:proofErr w:type="spellStart"/>
+      <w:r>
+        <w:rPr>
+          <w:rFonts w:ascii="Candara Light" w:hAnsi="Candara Light"/>
+          <w:b/>
+          <w:bCs/>
+          <w:i/>
+          <w:iCs/>
+          <w:lang w:val="en-US"/>
+        </w:rPr>
+        <w:t>Supabase</w:t>
+      </w:r>
+      <w:proofErr w:type="spellEnd"/>
+      <w:r>
+        <w:rPr>
+          <w:rFonts w:ascii="Candara Light" w:hAnsi="Candara Light"/>
+          <w:b/>
+          <w:bCs/>
+          <w:i/>
+          <w:iCs/>
+          <w:lang w:val="en-US"/>
+        </w:rPr>
+        <w:t xml:space="preserve"> tools for customer, loan, branch, and transaction data.</w:t>
+      </w:r>
+    </w:p>
+    <w:p>
+      <w:pPr>
+        <w:rPr>
+          <w:rFonts w:ascii="Candara Light" w:hAnsi="Candara Light"/>
+          <w:b/>
+          <w:bCs/>
+          <w:i/>
+          <w:iCs/>
+          <w:lang w:val="en-US"/>
+        </w:rPr>
+      </w:pPr>
+      <w:r>
+        <w:rPr>
+          <w:rFonts w:ascii="Candara Light" w:hAnsi="Candara Light"/>
+          <w:b/>
+          <w:bCs/>
+          <w:i/>
+          <w:iCs/>
+          <w:lang w:val="en-US"/>
+        </w:rPr>
+        <w:t xml:space="preserve">Use </w:t>
+      </w:r>
+      <w:proofErr w:type="spellStart"/>
+      <w:r>
+        <w:rPr>
+          <w:rFonts w:ascii="Candara Light" w:hAnsi="Candara Light"/>
+          <w:b/>
+          <w:bCs/>
+          <w:i/>
+          <w:iCs/>
+          <w:lang w:val="en-US"/>
+        </w:rPr>
+        <w:t>search_api</w:t>
+      </w:r>
+      <w:proofErr w:type="spellEnd"/>
+      <w:r>
+        <w:rPr>
+          <w:rFonts w:ascii="Candara Light" w:hAnsi="Candara Light"/>
+          <w:b/>
+          <w:bCs/>
+          <w:i/>
+          <w:iCs/>
+          <w:lang w:val="en-US"/>
+        </w:rPr>
+        <w:t xml:space="preserve"> for external rate lookup when internal context is weak or unavailable.</w:t>
+      </w:r>
+    </w:p>
+    <w:p>
+      <w:pPr>
+        <w:rPr>
+          <w:rFonts w:ascii="Candara Light" w:hAnsi="Candara Light"/>
+          <w:b/>
+          <w:bCs/>
+          <w:i/>
+          <w:iCs/>
+          <w:lang w:val="en-US"/>
+        </w:rPr>
+      </w:pPr>
+      <w:r>
+        <w:rPr>
+          <w:rFonts w:ascii="Candara Light" w:hAnsi="Candara Light"/>
+          <w:b/>
+          <w:bCs/>
+          <w:i/>
+          <w:iCs/>
+          <w:lang w:val="en-US"/>
+        </w:rPr>
+        <w:t xml:space="preserve">Use </w:t>
+      </w:r>
+      <w:proofErr w:type="spellStart"/>
+      <w:r>
+        <w:rPr>
+          <w:rFonts w:ascii="Candara Light" w:hAnsi="Candara Light"/>
+          <w:b/>
+          <w:bCs/>
+          <w:i/>
+          <w:iCs/>
+          <w:lang w:val="en-US"/>
+        </w:rPr>
+        <w:t>rag_retrieval</w:t>
+      </w:r>
+      <w:proofErr w:type="spellEnd"/>
+      <w:r>
+        <w:rPr>
+          <w:rFonts w:ascii="Candara Light" w:hAnsi="Candara Light"/>
+          <w:b/>
+          <w:bCs/>
+          <w:i/>
+          <w:iCs/>
+          <w:lang w:val="en-US"/>
+        </w:rPr>
+        <w:t xml:space="preserve"> for internal banking document context first.</w:t>
       </w:r>
     </w:p>
     <w:p>
@@ -1442,7 +1695,31 @@
           <w:iCs/>
           <w:lang w:val="en-US"/>
         </w:rPr>
-        <w:t>- support can update only CustomerName, Address, City, and State</w:t>
+        <w:t xml:space="preserve">- support can update only </w:t>
+      </w:r>
+      <w:proofErr w:type="spellStart"/>
+      <w:r>
+        <w:rPr>
+          <w:rFonts w:ascii="Candara Light" w:hAnsi="Candara Light"/>
+          <w:b/>
+          <w:bCs/>
+          <w:i/>
+          <w:iCs/>
+          <w:lang w:val="en-US"/>
+        </w:rPr>
+        <w:t>CustomerName</w:t>
+      </w:r>
+      <w:proofErr w:type="spellEnd"/>
+      <w:r>
+        <w:rPr>
+          <w:rFonts w:ascii="Candara Light" w:hAnsi="Candara Light"/>
+          <w:b/>
+          <w:bCs/>
+          <w:i/>
+          <w:iCs/>
+          <w:lang w:val="en-US"/>
+        </w:rPr>
+        <w:t>, Address, City, and State</w:t>
       </w:r>
     </w:p>
     <w:p>
@@ -1500,7 +1777,31 @@
           <w:iCs/>
           <w:lang w:val="en-US"/>
         </w:rPr>
-        <w:t>When internal RAG results are weak, incomplete, or do not answer the exact user query, prefer search_api as fallback.</w:t>
+        <w:t xml:space="preserve">When internal RAG results are weak, incomplete, or do not answer the exact user query, prefer </w:t>
+      </w:r>
+      <w:proofErr w:type="spellStart"/>
+      <w:r>
+        <w:rPr>
+          <w:rFonts w:ascii="Candara Light" w:hAnsi="Candara Light"/>
+          <w:b/>
+          <w:bCs/>
+          <w:i/>
+          <w:iCs/>
+          <w:lang w:val="en-US"/>
+        </w:rPr>
+        <w:t>search_api</w:t>
+      </w:r>
+      <w:proofErr w:type="spellEnd"/>
+      <w:r>
+        <w:rPr>
+          <w:rFonts w:ascii="Candara Light" w:hAnsi="Candara Light"/>
+          <w:b/>
+          <w:bCs/>
+          <w:i/>
+          <w:iCs/>
+          <w:lang w:val="en-US"/>
+        </w:rPr>
+        <w:t xml:space="preserve"> as fallback.</w:t>
       </w:r>
     </w:p>
     <w:p>
@@ -1569,18 +1870,7 @@
           <w:iCs/>
           <w:lang w:val="en-US"/>
         </w:rPr>
-        <w:t>Always produce a customer-friendly final response instead of raw tool output.</w:t>
-      </w:r>
-      <w:r>
-        <w:rPr>
-          <w:rFonts w:ascii="Candara Light" w:hAnsi="Candara Light"/>
-          <w:b/>
-          <w:bCs/>
-          <w:i/>
-          <w:iCs/>
-          <w:lang w:val="en-US"/>
-        </w:rPr>
-        <w:t>”””</w:t>
+        <w:t>Always produce a customer-friendly final response instead of raw tool output.”””</w:t>
       </w:r>
     </w:p>
     <w:p>
@@ -1621,6 +1911,7 @@
       </w:pPr>
       <w:r>
         <w:rPr>
+          <w:noProof/>
           <w:lang w:val="en-US"/>
         </w:rPr>
         <w:drawing>
@@ -1681,6 +1972,7 @@
       </w:pPr>
       <w:r>
         <w:rPr>
+          <w:noProof/>
           <w:lang w:val="en-US"/>
         </w:rPr>
         <w:lastRenderedPageBreak/>
@@ -1762,6 +2054,7 @@
       </w:pPr>
       <w:r>
         <w:rPr>
+          <w:noProof/>
           <w:lang w:val="en-US"/>
         </w:rPr>
         <w:drawing>
@@ -1811,24 +2104,33 @@
         <w:rPr>
           <w:lang w:val="en-US"/>
         </w:rPr>
-        <w:t>Search API :</w:t>
-      </w:r>
-    </w:p>
-    <w:p>
-      <w:pPr>
-        <w:rPr>
-          <w:lang w:val="en-US"/>
-        </w:rPr>
-      </w:pPr>
-    </w:p>
-    <w:p>
-      <w:pPr>
-        <w:rPr>
-          <w:lang w:val="en-US"/>
-        </w:rPr>
-      </w:pPr>
-      <w:r>
-        <w:rPr>
+        <w:t xml:space="preserve">Search </w:t>
+      </w:r>
+      <w:proofErr w:type="gramStart"/>
+      <w:r>
+        <w:rPr>
+          <w:lang w:val="en-US"/>
+        </w:rPr>
+        <w:t>API :</w:t>
+      </w:r>
+      <w:proofErr w:type="gramEnd"/>
+    </w:p>
+    <w:p>
+      <w:pPr>
+        <w:rPr>
+          <w:lang w:val="en-US"/>
+        </w:rPr>
+      </w:pPr>
+    </w:p>
+    <w:p>
+      <w:pPr>
+        <w:rPr>
+          <w:lang w:val="en-US"/>
+        </w:rPr>
+      </w:pPr>
+      <w:r>
+        <w:rPr>
+          <w:noProof/>
           <w:lang w:val="en-US"/>
         </w:rPr>
         <w:drawing>
@@ -1896,8 +2198,13 @@
           <w:numId w:val="7"/>
         </w:numPr>
       </w:pPr>
-      <w:r>
-        <w:t>Supabase login required before using the app.</w:t>
+      <w:proofErr w:type="spellStart"/>
+      <w:r>
+        <w:t>Supabase</w:t>
+      </w:r>
+      <w:proofErr w:type="spellEnd"/>
+      <w:r>
+        <w:t xml:space="preserve"> login required before using the app.</w:t>
       </w:r>
     </w:p>
     <w:p>
@@ -1918,8 +2225,13 @@
           <w:numId w:val="7"/>
         </w:numPr>
       </w:pPr>
-      <w:r>
-        <w:t>Supabase RLS enforcement for real data access using the logged-in user JWT.</w:t>
+      <w:proofErr w:type="spellStart"/>
+      <w:r>
+        <w:t>Supabase</w:t>
+      </w:r>
+      <w:proofErr w:type="spellEnd"/>
+      <w:r>
+        <w:t xml:space="preserve"> RLS enforcement for real data access using the logged-in user JWT.</w:t>
       </w:r>
     </w:p>
     <w:p>
@@ -2008,7 +2320,15 @@
         </w:numPr>
       </w:pPr>
       <w:r>
-        <w:t>Protected data queries bypass generic tool routing and use authenticated Supabase reads directly.</w:t>
+        <w:t xml:space="preserve">Protected data queries bypass generic tool routing and use authenticated </w:t>
+      </w:r>
+      <w:proofErr w:type="spellStart"/>
+      <w:r>
+        <w:t>Supabase</w:t>
+      </w:r>
+      <w:proofErr w:type="spellEnd"/>
+      <w:r>
+        <w:t xml:space="preserve"> reads directly.</w:t>
       </w:r>
     </w:p>
     <w:p>
@@ -2052,7 +2372,17 @@
         </w:numPr>
       </w:pPr>
       <w:r>
-        <w:t>Comparison queries use both RAG and search.Calculator expression validation before execution.</w:t>
+        <w:t xml:space="preserve">Comparison queries use both RAG and </w:t>
+      </w:r>
+      <w:proofErr w:type="spellStart"/>
+      <w:proofErr w:type="gramStart"/>
+      <w:r>
+        <w:t>search.Calculator</w:t>
+      </w:r>
+      <w:proofErr w:type="spellEnd"/>
+      <w:proofErr w:type="gramEnd"/>
+      <w:r>
+        <w:t xml:space="preserve"> expression validation before execution.</w:t>
       </w:r>
     </w:p>
     <w:p>
@@ -2134,47 +2464,6 @@
           <w:lang w:val="en-US"/>
         </w:rPr>
       </w:pPr>
-      <w:r>
-        <w:rPr>
-          <w:lang w:val="en-US"/>
-        </w:rPr>
-        <w:lastRenderedPageBreak/>
-        <w:drawing>
-          <wp:inline distT="0" distB="0" distL="0" distR="0" wp14:anchorId="56802A0C" wp14:editId="6EEA1D50">
-            <wp:extent cx="5731510" cy="4872355"/>
-            <wp:effectExtent l="0" t="0" r="2540" b="4445"/>
-            <wp:docPr id="342517606" name="Picture 1"/>
-            <wp:cNvGraphicFramePr>
-              <a:graphicFrameLocks xmlns:a="http://schemas.openxmlformats.org/drawingml/2006/main" noChangeAspect="1"/>
-            </wp:cNvGraphicFramePr>
-            <a:graphic xmlns:a="http://schemas.openxmlformats.org/drawingml/2006/main">
-              <a:graphicData uri="http://schemas.openxmlformats.org/drawingml/2006/picture">
-                <pic:pic xmlns:pic="http://schemas.openxmlformats.org/drawingml/2006/picture">
-                  <pic:nvPicPr>
-                    <pic:cNvPr id="342517606" name=""/>
-                    <pic:cNvPicPr/>
-                  </pic:nvPicPr>
-                  <pic:blipFill>
-                    <a:blip r:embed="rId17"/>
-                    <a:stretch>
-                      <a:fillRect/>
-                    </a:stretch>
-                  </pic:blipFill>
-                  <pic:spPr>
-                    <a:xfrm>
-                      <a:off x="0" y="0"/>
-                      <a:ext cx="5731510" cy="4872355"/>
-                    </a:xfrm>
-                    <a:prstGeom prst="rect">
-                      <a:avLst/>
-                    </a:prstGeom>
-                  </pic:spPr>
-                </pic:pic>
-              </a:graphicData>
-            </a:graphic>
-          </wp:inline>
-        </w:drawing>
-      </w:r>
     </w:p>
     <w:p>
       <w:pPr>
@@ -3702,6 +3991,7 @@
   <w:style w:type="character" w:default="1" w:styleId="DefaultParagraphFont">
     <w:name w:val="Default Paragraph Font"/>
     <w:uiPriority w:val="1"/>
+    <w:semiHidden/>
     <w:unhideWhenUsed/>
   </w:style>
   <w:style w:type="table" w:default="1" w:styleId="TableNormal">

</xml_diff>